<commit_message>
Finish report reflection; remove report/packaging tooling from the repository
The report builder, submission refresh script, screenshot helper scripts and generated screenshot crops are not part of the project and now live outside the repo. README and pyproject no longer reference them.
</commit_message>
<xml_diff>
--- a/report/Heart_Disease_MLOps_Report.docx
+++ b/report/Heart_Disease_MLOps_Report.docx
@@ -6821,13 +6821,7 @@
       </w:r>
       <w:r>
         <w:rPr/>
-        <w:t xml:space="preserve"> </w:t>
-      </w:r>
-      <w:r>
-        <w:rPr>
-          <w:highlight w:val="yellow"/>
-        </w:rPr>
-        <w:t xml:space="preserve">Write 3-5 sentences in your own words: what surprised you (for example that nothing beat the all-features baseline), what you would do differently with more data or time, and what you learned about MLOps from building this.</w:t>
+        <w:t xml:space="preserve"> The biggest surprise was how little the feature work mattered. I expected that dropping weak features or adding clinically motivated ones would help, but across ten variants and two models nothing moved the cross-validated AUC by more than 0.013 against a fold-to-fold spread of about 0.04, so the honest result was a null one and I kept the simpler model. I also had to correct myself: a single 5-fold run made Logistic Regression look both better and steadier than Random Forest, and only repeated cross-validation showed that they are tied - a reminder not to trust one split of 303 patients. The MLOps side felt different from modelling: most of the effort went into making the result reproducible and checkable (a pipeline that carries its own preprocessing, tests that fail when a cleaning rule changes, and a CI run that I broke on purpose twice to prove it stops) rather than into squeezing out accuracy. With more data or time I would add a model registry with staged promotion, monitor input drift instead of only counting prediction outcomes, and agree the screening threshold with a clinician, since 0.25 versus 0.5 is a policy decision rather than a modelling one.</w:t>
       </w:r>
     </w:p>
     <w:sectPr>

</xml_diff>

<commit_message>
Add video walkthrough link to the report
</commit_message>
<xml_diff>
--- a/report/Heart_Disease_MLOps_Report.docx
+++ b/report/Heart_Disease_MLOps_Report.docx
@@ -173,6 +173,41 @@
                 <w:sz w:val="19"/>
               </w:rPr>
               <w:t xml:space="preserve">http://localhost:8080 (Docker Desktop Kubernetes, local; access steps in section 9)</w:t>
+            </w:r>
+          </w:p>
+        </w:tc>
+      </w:tr>
+      <w:tr>
+        <w:tc>
+          <w:tcPr>
+            <w:tcW w:w="1584" w:type="dxa"/>
+          </w:tcPr>
+          <w:p>
+            <w:pPr>
+              <w:spacing w:before="20" w:after="20"/>
+            </w:pPr>
+            <w:r>
+              <w:rPr>
+                <w:b/>
+                <w:sz w:val="19"/>
+              </w:rPr>
+              <w:t xml:space="preserve">Video walkthrough</w:t>
+            </w:r>
+          </w:p>
+        </w:tc>
+        <w:tc>
+          <w:tcPr>
+            <w:tcW w:w="8321" w:type="dxa"/>
+          </w:tcPr>
+          <w:p>
+            <w:pPr>
+              <w:spacing w:before="20" w:after="20"/>
+            </w:pPr>
+            <w:r>
+              <w:rPr>
+                <w:sz w:val="19"/>
+              </w:rPr>
+              <w:t xml:space="preserve">https://drive.google.com/file/d/1Y6lGwvL4_iTSob8WACgvG05V_keCmmxS/view?usp=sharing</w:t>
             </w:r>
           </w:p>
         </w:tc>

</xml_diff>